<commit_message>
Completed the Workflow roughly
</commit_message>
<xml_diff>
--- a/mmttc_portal/core/templates_docs/Print_Application.docx
+++ b/mmttc_portal/core/templates_docs/Print_Application.docx
@@ -1583,7 +1583,11 @@
           <w:p>
             <w:pPr>
               <w:pStyle w:val="Normal"/>
-              <w:bidi w:val="0"/>
+              <w:widowControl/>
+              <w:suppressAutoHyphens w:val="true"/>
+              <w:bidi w:val="0"/>
+              <w:spacing w:before="0" w:after="0"/>
+              <w:ind w:hanging="0" w:left="0" w:right="-449"/>
               <w:jc w:val="left"/>
               <w:rPr>
                 <w:sz w:val="24"/>

</xml_diff>